<commit_message>
cv doc to pdf
cv doc to pdf
</commit_message>
<xml_diff>
--- a/PranayKumarCV.docx
+++ b/PranayKumarCV.docx
@@ -321,10 +321,7 @@
         <w:t>, SOLID Principles, Design Patterns, System Design, Scalability, High Availability, Concurrency Handling</w:t>
       </w:r>
       <w:r>
-        <w:t>,</w:t>
-      </w:r>
-      <w:r>
-        <w:t xml:space="preserve"> Asynchronous Programming</w:t>
+        <w:t>, Asynchronous Programming</w:t>
       </w:r>
     </w:p>
     <w:p>
@@ -364,7 +361,7 @@
         <w:br/>
       </w:r>
       <w:r>
-        <w:t>Azure (Basic), IIS (Application Deployment &amp; Hosting), CI/CD Pipelines (GitHub Actions – build &amp; deployment automation), Docker (Basic)</w:t>
+        <w:t>Azure (Basic), IIS (Application Deployment &amp; Hosting), CI/CD Pipelines (GitHub Actions – build &amp; deployment automation)</w:t>
       </w:r>
     </w:p>
     <w:p>
@@ -3100,6 +3097,7 @@
   <w:style w:type="character" w:default="1" w:styleId="DefaultParagraphFont">
     <w:name w:val="Default Paragraph Font"/>
     <w:uiPriority w:val="1"/>
+    <w:semiHidden/>
     <w:unhideWhenUsed/>
   </w:style>
   <w:style w:type="table" w:default="1" w:styleId="TableNormal">

</xml_diff>